<commit_message>
Chen anh demo vao Hinh 5.1 bao cao
</commit_message>
<xml_diff>
--- a/BC-final.docx
+++ b/BC-final.docx
@@ -5405,12 +5405,48 @@
           <w:szCs w:val="26"/>
         </w:rPr>
       </w:pPr>
-      <w:r>
-        <w:rPr>
-          <w:i/>
-          <w:szCs w:val="26"/>
-        </w:rPr>
-        <w:t>Hình 5.1: (placeholder) Giao diện tải file, bảng đặc trưng và top-5 kết quả.</w:t>
+      <w:r/>
+      <w:r>
+        <w:drawing>
+          <wp:inline xmlns:a="http://schemas.openxmlformats.org/drawingml/2006/main" xmlns:pic="http://schemas.openxmlformats.org/drawingml/2006/picture">
+            <wp:extent cx="5040000" cy="2392621"/>
+            <wp:docPr id="1" name="Picture 1"/>
+            <wp:cNvGraphicFramePr>
+              <a:graphicFrameLocks noChangeAspect="1"/>
+            </wp:cNvGraphicFramePr>
+            <a:graphic>
+              <a:graphicData uri="http://schemas.openxmlformats.org/drawingml/2006/picture">
+                <pic:pic>
+                  <pic:nvPicPr>
+                    <pic:cNvPr id="0" name="demo.png"/>
+                    <pic:cNvPicPr/>
+                  </pic:nvPicPr>
+                  <pic:blipFill>
+                    <a:blip r:embed="rId8"/>
+                    <a:stretch>
+                      <a:fillRect/>
+                    </a:stretch>
+                  </pic:blipFill>
+                  <pic:spPr>
+                    <a:xfrm>
+                      <a:off x="0" y="0"/>
+                      <a:ext cx="5040000" cy="2392621"/>
+                    </a:xfrm>
+                    <a:prstGeom prst="rect"/>
+                  </pic:spPr>
+                </pic:pic>
+              </a:graphicData>
+            </a:graphic>
+          </wp:inline>
+        </w:drawing>
+      </w:r>
+    </w:p>
+    <w:p>
+      <w:pPr>
+        <w:jc w:val="center"/>
+      </w:pPr>
+      <w:r>
+        <w:t>Hình 5.1: Giao diện demo — tải file TestHCSDLPT.wav, bảng 39 đặc trưng và top-5 kết quả (A_XeMay_030.wav hạng 1, cosine 0,8961).</w:t>
       </w:r>
     </w:p>
     <w:p>

</xml_diff>

<commit_message>
Format trang bia bao cao
</commit_message>
<xml_diff>
--- a/BC-final.docx
+++ b/BC-final.docx
@@ -71,6 +71,7 @@
     </w:p>
     <w:p>
       <w:pPr>
+        <w:jc w:val="center"/>
         <w:rPr>
           <w:szCs w:val="26"/>
         </w:rPr>
@@ -84,6 +85,7 @@
     </w:p>
     <w:p>
       <w:pPr>
+        <w:jc w:val="center"/>
         <w:rPr>
           <w:szCs w:val="26"/>
         </w:rPr>
@@ -97,6 +99,7 @@
     </w:p>
     <w:p>
       <w:pPr>
+        <w:jc w:val="center"/>
         <w:rPr>
           <w:szCs w:val="26"/>
         </w:rPr>
@@ -116,203 +119,35 @@
     </w:p>
     <w:p>
       <w:pPr>
-        <w:rPr>
-          <w:szCs w:val="26"/>
-        </w:rPr>
-      </w:pPr>
-      <w:r>
-        <w:rPr>
-          <w:szCs w:val="26"/>
-        </w:rPr>
-        <w:t xml:space="preserve">1.  </w:t>
-      </w:r>
-      <w:proofErr w:type="spellStart"/>
-      <w:r>
-        <w:rPr>
-          <w:szCs w:val="26"/>
-        </w:rPr>
-        <w:t>Lương</w:t>
-      </w:r>
-      <w:proofErr w:type="spellEnd"/>
-      <w:r>
-        <w:rPr>
-          <w:szCs w:val="26"/>
-        </w:rPr>
-        <w:t xml:space="preserve"> </w:t>
-      </w:r>
-      <w:proofErr w:type="spellStart"/>
-      <w:r>
-        <w:rPr>
-          <w:szCs w:val="26"/>
-        </w:rPr>
-        <w:t>Văn</w:t>
-      </w:r>
-      <w:proofErr w:type="spellEnd"/>
-      <w:r>
-        <w:rPr>
-          <w:szCs w:val="26"/>
-        </w:rPr>
-        <w:t xml:space="preserve"> </w:t>
-      </w:r>
-      <w:proofErr w:type="spellStart"/>
-      <w:r>
-        <w:rPr>
-          <w:szCs w:val="26"/>
-        </w:rPr>
-        <w:t>Luyện</w:t>
-      </w:r>
-      <w:proofErr w:type="spellEnd"/>
-      <w:r>
-        <w:rPr>
-          <w:szCs w:val="26"/>
-        </w:rPr>
-        <w:tab/>
-      </w:r>
-      <w:r>
-        <w:rPr>
-          <w:szCs w:val="26"/>
-        </w:rPr>
-        <w:t xml:space="preserve">            </w:t>
-      </w:r>
-      <w:r>
-        <w:rPr>
-          <w:szCs w:val="26"/>
-        </w:rPr>
-        <w:t>B21DCCN504</w:t>
+        <w:jc w:val="center"/>
+        <w:rPr>
+          <w:szCs w:val="26"/>
+        </w:rPr>
+      </w:pPr>
+      <w:r>
+        <w:t>1. Lương Văn Luyện – B21DCCN504</w:t>
       </w:r>
     </w:p>
     <w:p>
       <w:pPr>
-        <w:rPr>
-          <w:szCs w:val="26"/>
-        </w:rPr>
-      </w:pPr>
-      <w:r>
-        <w:rPr>
-          <w:szCs w:val="26"/>
-        </w:rPr>
-        <w:t xml:space="preserve">2.  </w:t>
-      </w:r>
-      <w:proofErr w:type="spellStart"/>
-      <w:r>
-        <w:rPr>
-          <w:szCs w:val="26"/>
-        </w:rPr>
-        <w:t>Sitthideth</w:t>
-      </w:r>
-      <w:proofErr w:type="spellEnd"/>
-      <w:r>
-        <w:rPr>
-          <w:szCs w:val="26"/>
-        </w:rPr>
-        <w:t xml:space="preserve"> HAPXAYTHONG</w:t>
-      </w:r>
-      <w:r>
-        <w:rPr>
-          <w:szCs w:val="26"/>
-        </w:rPr>
-        <w:tab/>
-      </w:r>
-      <w:r>
-        <w:rPr>
-          <w:szCs w:val="26"/>
-        </w:rPr>
-        <w:t xml:space="preserve"> </w:t>
-      </w:r>
-      <w:r>
-        <w:rPr>
-          <w:szCs w:val="26"/>
-        </w:rPr>
-        <w:t>B23DCCN999</w:t>
+        <w:jc w:val="center"/>
+        <w:rPr>
+          <w:szCs w:val="26"/>
+        </w:rPr>
+      </w:pPr>
+      <w:r>
+        <w:t>2. Sitthideth HAPXAYTHONG – B23DCCN999</w:t>
       </w:r>
     </w:p>
     <w:p>
       <w:pPr>
-        <w:rPr>
-          <w:szCs w:val="26"/>
-        </w:rPr>
-      </w:pPr>
-      <w:r>
-        <w:rPr>
-          <w:szCs w:val="26"/>
-        </w:rPr>
-        <w:t xml:space="preserve">3.  </w:t>
-      </w:r>
-      <w:proofErr w:type="spellStart"/>
-      <w:r>
-        <w:rPr>
-          <w:szCs w:val="26"/>
-        </w:rPr>
-        <w:t>Trương</w:t>
-      </w:r>
-      <w:proofErr w:type="spellEnd"/>
-      <w:r>
-        <w:rPr>
-          <w:szCs w:val="26"/>
-        </w:rPr>
-        <w:t xml:space="preserve"> </w:t>
-      </w:r>
-      <w:proofErr w:type="spellStart"/>
-      <w:r>
-        <w:rPr>
-          <w:szCs w:val="26"/>
-        </w:rPr>
-        <w:t>Vũ</w:t>
-      </w:r>
-      <w:proofErr w:type="spellEnd"/>
-      <w:r>
-        <w:rPr>
-          <w:szCs w:val="26"/>
-        </w:rPr>
-        <w:t xml:space="preserve"> </w:t>
-      </w:r>
-      <w:proofErr w:type="spellStart"/>
-      <w:r>
-        <w:rPr>
-          <w:szCs w:val="26"/>
-        </w:rPr>
-        <w:t>Khánh</w:t>
-      </w:r>
-      <w:proofErr w:type="spellEnd"/>
-      <w:r>
-        <w:rPr>
-          <w:szCs w:val="26"/>
-        </w:rPr>
-        <w:t xml:space="preserve"> </w:t>
-      </w:r>
-      <w:proofErr w:type="spellStart"/>
-      <w:proofErr w:type="gramStart"/>
-      <w:r>
-        <w:rPr>
-          <w:szCs w:val="26"/>
-        </w:rPr>
-        <w:t>Toàn</w:t>
-      </w:r>
-      <w:proofErr w:type="spellEnd"/>
-      <w:r>
-        <w:rPr>
-          <w:szCs w:val="26"/>
-        </w:rPr>
-        <w:t xml:space="preserve">  </w:t>
-      </w:r>
-      <w:r>
-        <w:rPr>
-          <w:szCs w:val="26"/>
-        </w:rPr>
-        <w:tab/>
-      </w:r>
-      <w:proofErr w:type="gramEnd"/>
-      <w:r>
-        <w:rPr>
-          <w:szCs w:val="26"/>
-        </w:rPr>
-        <w:t xml:space="preserve"> </w:t>
-      </w:r>
-      <w:r>
-        <w:rPr>
-          <w:szCs w:val="26"/>
-        </w:rPr>
-        <w:t>B22DCCN737</w:t>
+        <w:jc w:val="center"/>
+        <w:rPr>
+          <w:szCs w:val="26"/>
+        </w:rPr>
+      </w:pPr>
+      <w:r>
+        <w:t>3. Trương Vũ Khánh Toàn – B22DCCN737</w:t>
       </w:r>
     </w:p>
     <w:p>

</xml_diff>